<commit_message>
adding auto emailing recipients their temporary login and password upon approving their entry
</commit_message>
<xml_diff>
--- a/cds_website_note.docx
+++ b/cds_website_note.docx
@@ -6,6 +6,21 @@
       <w:pPr>
         <w:pStyle w:val="Heading2"/>
       </w:pPr>
+    </w:p>
+    <w:p>
+      <w:pPr>
+        <w:pStyle w:val="Heading2"/>
+      </w:pPr>
+    </w:p>
+    <w:p>
+      <w:pPr>
+        <w:pStyle w:val="Heading2"/>
+      </w:pPr>
+    </w:p>
+    <w:p>
+      <w:pPr>
+        <w:pStyle w:val="Heading2"/>
+      </w:pPr>
       <w:r>
         <w:t>To get started</w:t>
       </w:r>
@@ -19,40 +34,14 @@
       <w:r>
         <w:t>&gt;</w:t>
       </w:r>
-      <w:proofErr w:type="spellStart"/>
-      <w:r>
-        <w:t>npx</w:t>
-      </w:r>
-      <w:proofErr w:type="spellEnd"/>
-      <w:r>
-        <w:t xml:space="preserve"> </w:t>
-      </w:r>
-      <w:proofErr w:type="spellStart"/>
-      <w:r>
-        <w:t>create-next-app@latest</w:t>
-      </w:r>
-      <w:proofErr w:type="spellEnd"/>
+      <w:r>
+        <w:t>npx create-next-app@latest</w:t>
+      </w:r>
     </w:p>
     <w:p/>
     <w:p>
       <w:r>
-        <w:t xml:space="preserve">Then install </w:t>
-      </w:r>
-      <w:proofErr w:type="spellStart"/>
-      <w:r>
-        <w:t>pnpm</w:t>
-      </w:r>
-      <w:proofErr w:type="spellEnd"/>
-      <w:r>
-        <w:t xml:space="preserve"> the </w:t>
-      </w:r>
-      <w:proofErr w:type="spellStart"/>
-      <w:r>
-        <w:t>npm</w:t>
-      </w:r>
-      <w:proofErr w:type="spellEnd"/>
-      <w:r>
-        <w:t xml:space="preserve"> package manager</w:t>
+        <w:t>Then install pnpm the npm package manager</w:t>
       </w:r>
     </w:p>
     <w:p>
@@ -60,21 +49,8 @@
         <w:t>&gt;</w:t>
       </w:r>
       <w:r>
-        <w:t xml:space="preserve"> </w:t>
-      </w:r>
-      <w:proofErr w:type="spellStart"/>
-      <w:r>
-        <w:t>npm</w:t>
-      </w:r>
-      <w:proofErr w:type="spellEnd"/>
-      <w:r>
-        <w:t xml:space="preserve"> install -g </w:t>
-      </w:r>
-      <w:proofErr w:type="spellStart"/>
-      <w:r>
-        <w:t>pnpm</w:t>
-      </w:r>
-      <w:proofErr w:type="spellEnd"/>
+        <w:t xml:space="preserve"> npm install -g pnpm</w:t>
+      </w:r>
     </w:p>
     <w:p>
       <w:r>
@@ -83,21 +59,8 @@
     </w:p>
     <w:p>
       <w:r>
-        <w:t>&gt;</w:t>
-      </w:r>
-      <w:proofErr w:type="spellStart"/>
-      <w:r>
-        <w:t>pnpm</w:t>
-      </w:r>
-      <w:proofErr w:type="spellEnd"/>
-      <w:r>
-        <w:t xml:space="preserve"> </w:t>
-      </w:r>
-      <w:proofErr w:type="spellStart"/>
-      <w:r>
-        <w:t>i</w:t>
-      </w:r>
-      <w:proofErr w:type="spellEnd"/>
+        <w:t>&gt;pnpm i</w:t>
+      </w:r>
     </w:p>
     <w:p>
       <w:r>
@@ -114,15 +77,7 @@
     </w:p>
     <w:p>
       <w:r>
-        <w:t>&gt;</w:t>
-      </w:r>
-      <w:proofErr w:type="spellStart"/>
-      <w:r>
-        <w:t>pnpm</w:t>
-      </w:r>
-      <w:proofErr w:type="spellEnd"/>
-      <w:r>
-        <w:t xml:space="preserve"> dev</w:t>
+        <w:t>&gt;pnpm dev</w:t>
       </w:r>
     </w:p>
     <w:p>
@@ -148,15 +103,7 @@
     </w:p>
     <w:p>
       <w:r>
-        <w:t xml:space="preserve">Things you want to load quickly that calls data from a database should generally be SSR, </w:t>
-      </w:r>
-      <w:proofErr w:type="spellStart"/>
-      <w:r>
-        <w:t>page.tsx</w:t>
-      </w:r>
-      <w:proofErr w:type="spellEnd"/>
-      <w:r>
-        <w:t xml:space="preserve"> usually is that</w:t>
+        <w:t>Things you want to load quickly that calls data from a database should generally be SSR, page.tsx usually is that</w:t>
       </w:r>
     </w:p>
     <w:p>
@@ -168,37 +115,13 @@
         </w:numPr>
       </w:pPr>
       <w:r>
-        <w:t xml:space="preserve">One can </w:t>
-      </w:r>
-      <w:proofErr w:type="spellStart"/>
-      <w:r>
-        <w:t>getServerSideProps</w:t>
-      </w:r>
-      <w:proofErr w:type="spellEnd"/>
-      <w:r>
-        <w:t xml:space="preserve"> or </w:t>
-      </w:r>
-      <w:proofErr w:type="spellStart"/>
-      <w:r>
-        <w:t>getStatic</w:t>
-      </w:r>
-      <w:proofErr w:type="spellEnd"/>
-      <w:r>
-        <w:t xml:space="preserve"> props, but cannot use both together</w:t>
+        <w:t>One can getServerSideProps or getStatic props, but cannot use both together</w:t>
       </w:r>
     </w:p>
     <w:p/>
     <w:p>
       <w:r>
-        <w:t xml:space="preserve">Things that are interactive to users, like </w:t>
-      </w:r>
-      <w:proofErr w:type="spellStart"/>
-      <w:r>
-        <w:t>search.tsx</w:t>
-      </w:r>
-      <w:proofErr w:type="spellEnd"/>
-      <w:r>
-        <w:t xml:space="preserve"> should be CSR</w:t>
+        <w:t>Things that are interactive to users, like search.tsx should be CSR</w:t>
       </w:r>
     </w:p>
     <w:p>
@@ -212,19 +135,9 @@
           <w:bottom w:val="single" w:sz="6" w:space="1" w:color="auto"/>
         </w:pBdr>
       </w:pPr>
-      <w:proofErr w:type="spellStart"/>
-      <w:r>
-        <w:t>useEffect</w:t>
-      </w:r>
-      <w:proofErr w:type="spellEnd"/>
-      <w:r>
-        <w:t xml:space="preserve"> and </w:t>
-      </w:r>
-      <w:proofErr w:type="spellStart"/>
-      <w:r>
-        <w:t>useState</w:t>
-      </w:r>
-      <w:proofErr w:type="spellEnd"/>
+      <w:r>
+        <w:t>useEffect and useState</w:t>
+      </w:r>
     </w:p>
     <w:p>
       <w:r>
@@ -253,25 +166,8 @@
           <w:color w:val="EDEDED"/>
           <w:shd w:val="clear" w:color="auto" w:fill="000000"/>
         </w:rPr>
-        <w:t xml:space="preserve">For auth to work in production, you'll need to update your environment variables in your </w:t>
-      </w:r>
-      <w:proofErr w:type="spellStart"/>
-      <w:r>
-        <w:rPr>
-          <w:rFonts w:ascii="Arial" w:hAnsi="Arial" w:cs="Arial"/>
-          <w:color w:val="EDEDED"/>
-          <w:shd w:val="clear" w:color="auto" w:fill="000000"/>
-        </w:rPr>
-        <w:t>Vercel</w:t>
-      </w:r>
-      <w:proofErr w:type="spellEnd"/>
-      <w:r>
-        <w:rPr>
-          <w:rFonts w:ascii="Arial" w:hAnsi="Arial" w:cs="Arial"/>
-          <w:color w:val="EDEDED"/>
-          <w:shd w:val="clear" w:color="auto" w:fill="000000"/>
-        </w:rPr>
-        <w:t xml:space="preserve"> project too. Check out this </w:t>
+        <w:lastRenderedPageBreak/>
+        <w:t>For auth to work in production, you'll need to update your environment variables in your Vercel project too. Check out this </w:t>
       </w:r>
       <w:hyperlink r:id="rId7" w:tgtFrame="_blank" w:history="1">
         <w:r>
@@ -290,25 +186,7 @@
           <w:color w:val="EDEDED"/>
           <w:shd w:val="clear" w:color="auto" w:fill="000000"/>
         </w:rPr>
-        <w:t xml:space="preserve"> on how to add environment variables on </w:t>
-      </w:r>
-      <w:proofErr w:type="spellStart"/>
-      <w:r>
-        <w:rPr>
-          <w:rFonts w:ascii="Arial" w:hAnsi="Arial" w:cs="Arial"/>
-          <w:color w:val="EDEDED"/>
-          <w:shd w:val="clear" w:color="auto" w:fill="000000"/>
-        </w:rPr>
-        <w:t>Vercel</w:t>
-      </w:r>
-      <w:proofErr w:type="spellEnd"/>
-      <w:r>
-        <w:rPr>
-          <w:rFonts w:ascii="Arial" w:hAnsi="Arial" w:cs="Arial"/>
-          <w:color w:val="EDEDED"/>
-          <w:shd w:val="clear" w:color="auto" w:fill="000000"/>
-        </w:rPr>
-        <w:t>.</w:t>
+        <w:t> on how to add environment variables on Vercel.</w:t>
       </w:r>
     </w:p>
     <w:p>
@@ -316,7 +194,6 @@
         <w:pStyle w:val="Heading2"/>
       </w:pPr>
       <w:r>
-        <w:lastRenderedPageBreak/>
         <w:t>------------------------------------</w:t>
       </w:r>
     </w:p>
@@ -353,13 +230,8 @@
         </w:numPr>
       </w:pPr>
       <w:r>
-        <w:t xml:space="preserve">react is the core React </w:t>
-      </w:r>
-      <w:proofErr w:type="spellStart"/>
-      <w:r>
-        <w:t>library.</w:t>
-      </w:r>
-      <w:proofErr w:type="spellEnd"/>
+        <w:t>react is the core React library.</w:t>
+      </w:r>
     </w:p>
     <w:p>
       <w:pPr>
@@ -370,15 +242,7 @@
         </w:numPr>
       </w:pPr>
       <w:r>
-        <w:t>react-</w:t>
-      </w:r>
-      <w:proofErr w:type="spellStart"/>
-      <w:r>
-        <w:t>dom</w:t>
-      </w:r>
-      <w:proofErr w:type="spellEnd"/>
-      <w:r>
-        <w:t xml:space="preserve"> provides DOM-specific methods that enable you to use React with the DOM.</w:t>
+        <w:t>react-dom provides DOM-specific methods that enable you to use React with the DOM.</w:t>
       </w:r>
     </w:p>
     <w:p/>
@@ -434,57 +298,18 @@
     </w:p>
     <w:p>
       <w:r>
-        <w:t xml:space="preserve">To make the button do something when clicked, you can use the </w:t>
-      </w:r>
-      <w:proofErr w:type="spellStart"/>
-      <w:r>
-        <w:t>onClick</w:t>
-      </w:r>
-      <w:proofErr w:type="spellEnd"/>
-      <w:r>
-        <w:t xml:space="preserve"> event:</w:t>
-      </w:r>
-    </w:p>
-    <w:p>
-      <w:r>
-        <w:t xml:space="preserve">In React, event names are </w:t>
-      </w:r>
-      <w:proofErr w:type="spellStart"/>
-      <w:r>
-        <w:t>camelCased</w:t>
-      </w:r>
-      <w:proofErr w:type="spellEnd"/>
-      <w:r>
-        <w:t xml:space="preserve">. The </w:t>
-      </w:r>
-      <w:proofErr w:type="spellStart"/>
-      <w:r>
-        <w:t>onClick</w:t>
-      </w:r>
-      <w:proofErr w:type="spellEnd"/>
-      <w:r>
-        <w:t xml:space="preserve"> event is one of many possible events you can use to respond to user interaction. For example, you can use </w:t>
-      </w:r>
-      <w:proofErr w:type="spellStart"/>
-      <w:r>
-        <w:t>onChange</w:t>
-      </w:r>
-      <w:proofErr w:type="spellEnd"/>
-      <w:r>
-        <w:t xml:space="preserve"> for input fields or </w:t>
-      </w:r>
-      <w:proofErr w:type="spellStart"/>
-      <w:r>
-        <w:t>onSubmit</w:t>
-      </w:r>
-      <w:proofErr w:type="spellEnd"/>
-      <w:r>
-        <w:t xml:space="preserve"> for forms.</w:t>
+        <w:t>To make the button do something when clicked, you can use the onClick event:</w:t>
+      </w:r>
+    </w:p>
+    <w:p>
+      <w:r>
+        <w:t>In React, event names are camelCased. The onClick event is one of many possible events you can use to respond to user interaction. For example, you can use onChange for input fields or onSubmit for forms.</w:t>
       </w:r>
     </w:p>
     <w:p/>
     <w:p>
       <w:r>
+        <w:lastRenderedPageBreak/>
         <w:t xml:space="preserve">Handling events </w:t>
       </w:r>
     </w:p>
@@ -543,14 +368,9 @@
                             <w:r>
                               <w:t xml:space="preserve">function </w:t>
                             </w:r>
-                            <w:proofErr w:type="spellStart"/>
                             <w:proofErr w:type="gramStart"/>
                             <w:r>
-                              <w:t>HomePage</w:t>
-                            </w:r>
-                            <w:proofErr w:type="spellEnd"/>
-                            <w:r>
-                              <w:t>(</w:t>
+                              <w:t>HomePage(</w:t>
                             </w:r>
                             <w:proofErr w:type="gramEnd"/>
                             <w:r>
@@ -570,14 +390,9 @@
                             <w:r>
                               <w:t xml:space="preserve">  function </w:t>
                             </w:r>
-                            <w:proofErr w:type="spellStart"/>
                             <w:proofErr w:type="gramStart"/>
                             <w:r>
-                              <w:t>handleClick</w:t>
-                            </w:r>
-                            <w:proofErr w:type="spellEnd"/>
-                            <w:r>
-                              <w:t>(</w:t>
+                              <w:t>handleClick(</w:t>
                             </w:r>
                             <w:proofErr w:type="gramEnd"/>
                             <w:r>
@@ -624,23 +439,7 @@
                           </w:p>
                           <w:p>
                             <w:r>
-                              <w:t xml:space="preserve">      &lt;button </w:t>
-                            </w:r>
-                            <w:proofErr w:type="spellStart"/>
-                            <w:r>
-                              <w:t>onClick</w:t>
-                            </w:r>
-                            <w:proofErr w:type="spellEnd"/>
-                            <w:r>
-                              <w:t>={</w:t>
-                            </w:r>
-                            <w:proofErr w:type="spellStart"/>
-                            <w:r>
-                              <w:t>handleClick</w:t>
-                            </w:r>
-                            <w:proofErr w:type="spellEnd"/>
-                            <w:r>
-                              <w:t>}&gt;Like&lt;/button&gt;</w:t>
+                              <w:t xml:space="preserve">      &lt;button onClick={handleClick}&gt;Like&lt;/button&gt;</w:t>
                             </w:r>
                           </w:p>
                           <w:p>
@@ -687,14 +486,9 @@
                       <w:r>
                         <w:t xml:space="preserve">function </w:t>
                       </w:r>
-                      <w:proofErr w:type="spellStart"/>
                       <w:proofErr w:type="gramStart"/>
                       <w:r>
-                        <w:t>HomePage</w:t>
-                      </w:r>
-                      <w:proofErr w:type="spellEnd"/>
-                      <w:r>
-                        <w:t>(</w:t>
+                        <w:t>HomePage(</w:t>
                       </w:r>
                       <w:proofErr w:type="gramEnd"/>
                       <w:r>
@@ -714,14 +508,9 @@
                       <w:r>
                         <w:t xml:space="preserve">  function </w:t>
                       </w:r>
-                      <w:proofErr w:type="spellStart"/>
                       <w:proofErr w:type="gramStart"/>
                       <w:r>
-                        <w:t>handleClick</w:t>
-                      </w:r>
-                      <w:proofErr w:type="spellEnd"/>
-                      <w:r>
-                        <w:t>(</w:t>
+                        <w:t>handleClick(</w:t>
                       </w:r>
                       <w:proofErr w:type="gramEnd"/>
                       <w:r>
@@ -768,23 +557,7 @@
                     </w:p>
                     <w:p>
                       <w:r>
-                        <w:t xml:space="preserve">      &lt;button </w:t>
-                      </w:r>
-                      <w:proofErr w:type="spellStart"/>
-                      <w:r>
-                        <w:t>onClick</w:t>
-                      </w:r>
-                      <w:proofErr w:type="spellEnd"/>
-                      <w:r>
-                        <w:t>={</w:t>
-                      </w:r>
-                      <w:proofErr w:type="spellStart"/>
-                      <w:r>
-                        <w:t>handleClick</w:t>
-                      </w:r>
-                      <w:proofErr w:type="spellEnd"/>
-                      <w:r>
-                        <w:t>}&gt;Like&lt;/button&gt;</w:t>
+                        <w:t xml:space="preserve">      &lt;button onClick={handleClick}&gt;Like&lt;/button&gt;</w:t>
                       </w:r>
                     </w:p>
                     <w:p>
@@ -861,14 +634,9 @@
       <w:r>
         <w:t xml:space="preserve">You can use state to store and increment the number of times a user has clicked the "Like" button. In fact, the React hook used to manage state is called: </w:t>
       </w:r>
-      <w:proofErr w:type="spellStart"/>
       <w:proofErr w:type="gramStart"/>
       <w:r>
-        <w:t>useState</w:t>
-      </w:r>
-      <w:proofErr w:type="spellEnd"/>
-      <w:r>
-        <w:t>(</w:t>
+        <w:t>useState(</w:t>
       </w:r>
       <w:proofErr w:type="gramEnd"/>
       <w:r>
@@ -907,9 +675,9 @@
           <w:szCs w:val="20"/>
           <w:bdr w:val="single" w:sz="2" w:space="0" w:color="auto" w:frame="1"/>
         </w:rPr>
-        <w:t xml:space="preserve">const [likes, </w:t>
-      </w:r>
-      <w:proofErr w:type="spellStart"/>
+        <w:t>const [likes, setLikes] = React.useState(0</w:t>
+      </w:r>
+      <w:proofErr w:type="gramStart"/>
       <w:r>
         <w:rPr>
           <w:rFonts w:ascii="Roboto Mono" w:hAnsi="Roboto Mono"/>
@@ -917,55 +685,6 @@
           <w:szCs w:val="20"/>
           <w:bdr w:val="single" w:sz="2" w:space="0" w:color="auto" w:frame="1"/>
         </w:rPr>
-        <w:t>setLikes</w:t>
-      </w:r>
-      <w:proofErr w:type="spellEnd"/>
-      <w:r>
-        <w:rPr>
-          <w:rFonts w:ascii="Roboto Mono" w:hAnsi="Roboto Mono"/>
-          <w:sz w:val="20"/>
-          <w:szCs w:val="20"/>
-          <w:bdr w:val="single" w:sz="2" w:space="0" w:color="auto" w:frame="1"/>
-        </w:rPr>
-        <w:t xml:space="preserve">] = </w:t>
-      </w:r>
-      <w:proofErr w:type="spellStart"/>
-      <w:r>
-        <w:rPr>
-          <w:rFonts w:ascii="Roboto Mono" w:hAnsi="Roboto Mono"/>
-          <w:sz w:val="20"/>
-          <w:szCs w:val="20"/>
-          <w:bdr w:val="single" w:sz="2" w:space="0" w:color="auto" w:frame="1"/>
-        </w:rPr>
-        <w:t>React.useState</w:t>
-      </w:r>
-      <w:proofErr w:type="spellEnd"/>
-      <w:r>
-        <w:rPr>
-          <w:rFonts w:ascii="Roboto Mono" w:hAnsi="Roboto Mono"/>
-          <w:sz w:val="20"/>
-          <w:szCs w:val="20"/>
-          <w:bdr w:val="single" w:sz="2" w:space="0" w:color="auto" w:frame="1"/>
-        </w:rPr>
-        <w:t>(</w:t>
-      </w:r>
-      <w:r>
-        <w:rPr>
-          <w:rFonts w:ascii="Roboto Mono" w:hAnsi="Roboto Mono"/>
-          <w:sz w:val="20"/>
-          <w:szCs w:val="20"/>
-          <w:bdr w:val="single" w:sz="2" w:space="0" w:color="auto" w:frame="1"/>
-        </w:rPr>
-        <w:t>0</w:t>
-      </w:r>
-      <w:proofErr w:type="gramStart"/>
-      <w:r>
-        <w:rPr>
-          <w:rFonts w:ascii="Roboto Mono" w:hAnsi="Roboto Mono"/>
-          <w:sz w:val="20"/>
-          <w:szCs w:val="20"/>
-          <w:bdr w:val="single" w:sz="2" w:space="0" w:color="auto" w:frame="1"/>
-        </w:rPr>
         <w:t>);</w:t>
       </w:r>
       <w:proofErr w:type="gramEnd"/>
@@ -976,23 +695,7 @@
     <w:p/>
     <w:p>
       <w:r>
-        <w:t>When you use Next.js in your project, you do not need to load the react and react-</w:t>
-      </w:r>
-      <w:proofErr w:type="spellStart"/>
-      <w:r>
-        <w:t>dom</w:t>
-      </w:r>
-      <w:proofErr w:type="spellEnd"/>
-      <w:r>
-        <w:t xml:space="preserve"> scripts from unpkg.com anymore. Instead, you can install these packages locally using </w:t>
-      </w:r>
-      <w:proofErr w:type="spellStart"/>
-      <w:r>
-        <w:t>npm</w:t>
-      </w:r>
-      <w:proofErr w:type="spellEnd"/>
-      <w:r>
-        <w:t xml:space="preserve"> or your preferred package manager.</w:t>
+        <w:t>When you use Next.js in your project, you do not need to load the react and react-dom scripts from unpkg.com anymore. Instead, you can install these packages locally using npm or your preferred package manager.</w:t>
       </w:r>
     </w:p>
     <w:p/>
@@ -1001,37 +704,8 @@
       <w:r>
         <w:t xml:space="preserve">Once you install React with </w:t>
       </w:r>
-      <w:proofErr w:type="spellStart"/>
-      <w:r>
-        <w:t>npm</w:t>
-      </w:r>
-      <w:proofErr w:type="spellEnd"/>
-      <w:r>
-        <w:t xml:space="preserve"> install </w:t>
-      </w:r>
-      <w:proofErr w:type="spellStart"/>
-      <w:r>
-        <w:t>react@latest</w:t>
-      </w:r>
-      <w:proofErr w:type="spellEnd"/>
-      <w:r>
-        <w:t xml:space="preserve"> </w:t>
-      </w:r>
-      <w:proofErr w:type="spellStart"/>
-      <w:r>
-        <w:t>react-dom@latest</w:t>
-      </w:r>
-      <w:proofErr w:type="spellEnd"/>
-      <w:r>
-        <w:t xml:space="preserve"> </w:t>
-      </w:r>
-      <w:proofErr w:type="spellStart"/>
-      <w:r>
-        <w:t>next@latest</w:t>
-      </w:r>
-      <w:proofErr w:type="spellEnd"/>
-      <w:r>
-        <w:t xml:space="preserve"> </w:t>
+      <w:r>
+        <w:t xml:space="preserve">npm install react@latest react-dom@latest next@latest </w:t>
       </w:r>
     </w:p>
     <w:p>
@@ -1048,13 +722,8 @@
       <w:r>
         <w:t>In terminal run &gt;</w:t>
       </w:r>
-      <w:proofErr w:type="spellStart"/>
-      <w:r>
-        <w:t>npm</w:t>
-      </w:r>
-      <w:proofErr w:type="spellEnd"/>
-      <w:r>
-        <w:t xml:space="preserve"> run dev</w:t>
+      <w:r>
+        <w:t>npm run dev</w:t>
       </w:r>
     </w:p>
     <w:p>
@@ -1101,7 +770,6 @@
           <w:shd w:val="clear" w:color="auto" w:fill="0A0A0A"/>
         </w:rPr>
       </w:pPr>
-      <w:proofErr w:type="spellStart"/>
       <w:r>
         <w:rPr>
           <w:rFonts w:ascii="Roboto Mono" w:hAnsi="Roboto Mono"/>
@@ -1110,10 +778,11 @@
           <w:bdr w:val="single" w:sz="2" w:space="0" w:color="auto" w:frame="1"/>
           <w:shd w:val="clear" w:color="auto" w:fill="0A0A0A"/>
         </w:rPr>
-        <w:t>npm</w:t>
-      </w:r>
-      <w:proofErr w:type="spellEnd"/>
-      <w:r>
+        <w:t>npm install -g pnpm</w:t>
+      </w:r>
+    </w:p>
+    <w:p>
+      <w:pPr>
         <w:rPr>
           <w:rFonts w:ascii="Roboto Mono" w:hAnsi="Roboto Mono"/>
           <w:sz w:val="20"/>
@@ -1121,43 +790,11 @@
           <w:bdr w:val="single" w:sz="2" w:space="0" w:color="auto" w:frame="1"/>
           <w:shd w:val="clear" w:color="auto" w:fill="0A0A0A"/>
         </w:rPr>
-        <w:t xml:space="preserve"> install -g </w:t>
-      </w:r>
-      <w:proofErr w:type="spellStart"/>
-      <w:r>
-        <w:rPr>
-          <w:rFonts w:ascii="Roboto Mono" w:hAnsi="Roboto Mono"/>
-          <w:sz w:val="20"/>
-          <w:szCs w:val="20"/>
-          <w:bdr w:val="single" w:sz="2" w:space="0" w:color="auto" w:frame="1"/>
-          <w:shd w:val="clear" w:color="auto" w:fill="0A0A0A"/>
-        </w:rPr>
-        <w:t>pnpm</w:t>
-      </w:r>
-      <w:proofErr w:type="spellEnd"/>
-    </w:p>
-    <w:p>
-      <w:pPr>
-        <w:rPr>
-          <w:rFonts w:ascii="Roboto Mono" w:hAnsi="Roboto Mono"/>
-          <w:sz w:val="20"/>
-          <w:szCs w:val="20"/>
-          <w:bdr w:val="single" w:sz="2" w:space="0" w:color="auto" w:frame="1"/>
-          <w:shd w:val="clear" w:color="auto" w:fill="0A0A0A"/>
-        </w:rPr>
-      </w:pPr>
-    </w:p>
-    <w:p>
-      <w:r>
-        <w:t xml:space="preserve">You want to add global </w:t>
-      </w:r>
-      <w:proofErr w:type="spellStart"/>
-      <w:r>
-        <w:t>css</w:t>
-      </w:r>
-      <w:proofErr w:type="spellEnd"/>
-      <w:r>
-        <w:t xml:space="preserve"> at the top layer of the app. </w:t>
+      </w:pPr>
+    </w:p>
+    <w:p>
+      <w:r>
+        <w:t xml:space="preserve">You want to add global css at the top layer of the app. </w:t>
       </w:r>
       <w:proofErr w:type="gramStart"/>
       <w:r>
@@ -1165,31 +802,15 @@
       </w:r>
       <w:proofErr w:type="gramEnd"/>
       <w:r>
-        <w:t xml:space="preserve"> in the </w:t>
-      </w:r>
-      <w:proofErr w:type="spellStart"/>
-      <w:r>
-        <w:t>layout.</w:t>
-      </w:r>
-      <w:r>
-        <w:t>tsx</w:t>
-      </w:r>
-      <w:proofErr w:type="spellEnd"/>
-      <w:r>
-        <w:t xml:space="preserve"> file:</w:t>
-      </w:r>
-    </w:p>
-    <w:p>
-      <w:r>
-        <w:t>Import ‘@/app/</w:t>
-      </w:r>
-      <w:proofErr w:type="spellStart"/>
-      <w:r>
-        <w:t>ui</w:t>
-      </w:r>
-      <w:proofErr w:type="spellEnd"/>
-      <w:r>
-        <w:t>/global.css</w:t>
+        <w:t xml:space="preserve"> in the layout.</w:t>
+      </w:r>
+      <w:r>
+        <w:t>tsx file:</w:t>
+      </w:r>
+    </w:p>
+    <w:p>
+      <w:r>
+        <w:t>Import ‘@/app/ui/global.css</w:t>
       </w:r>
       <w:proofErr w:type="gramStart"/>
       <w:r>
@@ -1214,6 +835,7 @@
     </w:p>
     <w:p>
       <w:r>
+        <w:lastRenderedPageBreak/>
         <w:t xml:space="preserve">## how did that just </w:t>
       </w:r>
       <w:proofErr w:type="gramStart"/>
@@ -1222,52 +844,20 @@
       </w:r>
       <w:proofErr w:type="gramEnd"/>
       <w:r>
-        <w:t xml:space="preserve"> all the </w:t>
-      </w:r>
-      <w:proofErr w:type="spellStart"/>
-      <w:r>
-        <w:t>tailwindscss</w:t>
-      </w:r>
-      <w:proofErr w:type="spellEnd"/>
-      <w:r>
-        <w:t xml:space="preserve">?? And got </w:t>
+        <w:t xml:space="preserve"> all the tailwindscss?? And got </w:t>
       </w:r>
       <w:proofErr w:type="gramStart"/>
       <w:r>
-        <w:t xml:space="preserve">that </w:t>
-      </w:r>
-      <w:proofErr w:type="spellStart"/>
-      <w:r>
-        <w:t>tailwinds</w:t>
+        <w:t>that tailwinds</w:t>
       </w:r>
       <w:proofErr w:type="gramEnd"/>
       <w:r>
-        <w:t>.config.ts</w:t>
-      </w:r>
-      <w:proofErr w:type="spellEnd"/>
-      <w:r>
-        <w:t xml:space="preserve"> is in the root folder </w:t>
-      </w:r>
-      <w:proofErr w:type="spellStart"/>
-      <w:r>
-        <w:t>nextjs</w:t>
-      </w:r>
-      <w:proofErr w:type="spellEnd"/>
-      <w:r>
-        <w:t>-dashboard</w:t>
-      </w:r>
-    </w:p>
-    <w:p>
-      <w:r>
-        <w:t>## in the app/</w:t>
-      </w:r>
-      <w:proofErr w:type="spellStart"/>
-      <w:r>
-        <w:t>ui</w:t>
-      </w:r>
-      <w:proofErr w:type="spellEnd"/>
-      <w:r>
-        <w:t>/folder, that’s where you keep the global.css file</w:t>
+        <w:t>.config.ts is in the root folder nextjs-dashboard</w:t>
+      </w:r>
+    </w:p>
+    <w:p>
+      <w:r>
+        <w:t>## in the app/ui/folder, that’s where you keep the global.css file</w:t>
       </w:r>
     </w:p>
     <w:p/>
@@ -1294,10 +884,11 @@
           <w:szCs w:val="21"/>
           <w:shd w:val="clear" w:color="auto" w:fill="000000"/>
         </w:rPr>
-        <w:t>neon-</w:t>
-      </w:r>
-      <w:proofErr w:type="spellStart"/>
-      <w:r>
+        <w:t>neon-lightBlue-school</w:t>
+      </w:r>
+    </w:p>
+    <w:p>
+      <w:pPr>
         <w:rPr>
           <w:rFonts w:ascii="Arial" w:hAnsi="Arial" w:cs="Arial"/>
           <w:color w:val="EDEDED"/>
@@ -1305,10 +896,10 @@
           <w:szCs w:val="21"/>
           <w:shd w:val="clear" w:color="auto" w:fill="000000"/>
         </w:rPr>
-        <w:t>lightBlue</w:t>
-      </w:r>
-      <w:proofErr w:type="spellEnd"/>
-      <w:r>
+      </w:pPr>
+    </w:p>
+    <w:p>
+      <w:pPr>
         <w:rPr>
           <w:rFonts w:ascii="Arial" w:hAnsi="Arial" w:cs="Arial"/>
           <w:color w:val="EDEDED"/>
@@ -1316,8 +907,7 @@
           <w:szCs w:val="21"/>
           <w:shd w:val="clear" w:color="auto" w:fill="000000"/>
         </w:rPr>
-        <w:t>-school</w:t>
-      </w:r>
+      </w:pPr>
     </w:p>
     <w:p>
       <w:pPr>
@@ -1331,73 +921,18 @@
       </w:pPr>
     </w:p>
     <w:p>
-      <w:pPr>
-        <w:rPr>
-          <w:rFonts w:ascii="Arial" w:hAnsi="Arial" w:cs="Arial"/>
-          <w:color w:val="EDEDED"/>
-          <w:sz w:val="21"/>
-          <w:szCs w:val="21"/>
-          <w:shd w:val="clear" w:color="auto" w:fill="000000"/>
-        </w:rPr>
-      </w:pPr>
-    </w:p>
-    <w:p>
-      <w:pPr>
-        <w:rPr>
-          <w:rFonts w:ascii="Arial" w:hAnsi="Arial" w:cs="Arial"/>
-          <w:color w:val="EDEDED"/>
-          <w:sz w:val="21"/>
-          <w:szCs w:val="21"/>
-          <w:shd w:val="clear" w:color="auto" w:fill="000000"/>
-        </w:rPr>
-      </w:pPr>
-    </w:p>
-    <w:p>
       <w:r>
         <w:t xml:space="preserve">Finally, run </w:t>
       </w:r>
-      <w:proofErr w:type="spellStart"/>
       <w:r>
         <w:rPr>
           <w:b/>
           <w:bCs/>
         </w:rPr>
-        <w:t>pnpm</w:t>
-      </w:r>
-      <w:proofErr w:type="spellEnd"/>
-      <w:r>
-        <w:rPr>
-          <w:b/>
-          <w:bCs/>
-        </w:rPr>
-        <w:t xml:space="preserve"> </w:t>
-      </w:r>
-      <w:proofErr w:type="spellStart"/>
-      <w:r>
-        <w:rPr>
-          <w:b/>
-          <w:bCs/>
-        </w:rPr>
-        <w:t>i</w:t>
-      </w:r>
-      <w:proofErr w:type="spellEnd"/>
-      <w:r>
-        <w:rPr>
-          <w:b/>
-          <w:bCs/>
-        </w:rPr>
-        <w:t xml:space="preserve"> @vercel/postgres</w:t>
-      </w:r>
-      <w:r>
-        <w:t xml:space="preserve"> in your terminal to install the </w:t>
-      </w:r>
-      <w:proofErr w:type="spellStart"/>
-      <w:r>
-        <w:t>Vercel</w:t>
-      </w:r>
-      <w:proofErr w:type="spellEnd"/>
-      <w:r>
-        <w:t xml:space="preserve"> Postgres SDK.</w:t>
+        <w:t>pnpm i @vercel/postgres</w:t>
+      </w:r>
+      <w:r>
+        <w:t xml:space="preserve"> in your terminal to install the Vercel Postgres SDK.</w:t>
       </w:r>
     </w:p>
     <w:p/>
@@ -1447,23 +982,55 @@
       </w:r>
     </w:p>
     <w:p>
-      <w:proofErr w:type="spellStart"/>
-      <w:r>
-        <w:t>Route.ts</w:t>
-      </w:r>
-      <w:proofErr w:type="spellEnd"/>
-      <w:r>
-        <w:t xml:space="preserve"> file can be nested anywhere inside /app directory, but can’t be in the </w:t>
-      </w:r>
-      <w:proofErr w:type="spellStart"/>
-      <w:r>
-        <w:t>samd</w:t>
-      </w:r>
-      <w:proofErr w:type="spellEnd"/>
+      <w:r>
+        <w:t>Route.ts file can be nested anywhere inside /app directory, but can’t be in the sam</w:t>
+      </w:r>
+      <w:r>
+        <w:t>e</w:t>
+      </w:r>
       <w:r>
         <w:t xml:space="preserve"> route segment level as page.js</w:t>
       </w:r>
     </w:p>
+    <w:p>
+      <w:r>
+        <w:t xml:space="preserve">you can also use it to test functions, </w:t>
+      </w:r>
+      <w:proofErr w:type="gramStart"/>
+      <w:r>
+        <w:t>write  the</w:t>
+      </w:r>
+      <w:proofErr w:type="gramEnd"/>
+      <w:r>
+        <w:t xml:space="preserve"> functions you want to call</w:t>
+      </w:r>
+      <w:r>
+        <w:t xml:space="preserve"> in app/query/route.ts</w:t>
+      </w:r>
+    </w:p>
+    <w:p>
+      <w:r>
+        <w:t xml:space="preserve">first run it locally by calling </w:t>
+      </w:r>
+      <w:r>
+        <w:rPr>
+          <w:b/>
+          <w:bCs/>
+        </w:rPr>
+        <w:t>npm run dev</w:t>
+      </w:r>
+    </w:p>
+    <w:p>
+      <w:r>
+        <w:t>and then</w:t>
+      </w:r>
+      <w:r>
+        <w:t xml:space="preserve"> navigate to localhost:3000/query</w:t>
+      </w:r>
+      <w:r>
+        <w:t xml:space="preserve"> in browser, and it should output whatever in the browser</w:t>
+      </w:r>
+    </w:p>
     <w:p/>
     <w:p>
       <w:pPr>
@@ -1475,15 +1042,7 @@
     </w:p>
     <w:p>
       <w:r>
-        <w:t xml:space="preserve">In React, you can use the action attribute in the &lt;form&gt; element to invoke actions. The action will automatically receive the native </w:t>
-      </w:r>
-      <w:proofErr w:type="spellStart"/>
-      <w:r>
-        <w:t>FormData</w:t>
-      </w:r>
-      <w:proofErr w:type="spellEnd"/>
-      <w:r>
-        <w:t xml:space="preserve"> object, containing the captured data.</w:t>
+        <w:t>In React, you can use the action attribute in the &lt;form&gt; element to invoke actions. The action will automatically receive the native FormData object, containing the captured data.</w:t>
       </w:r>
     </w:p>
     <w:p/>
@@ -1495,7 +1054,6 @@
     <w:p/>
     <w:p>
       <w:r>
-        <w:lastRenderedPageBreak/>
         <w:t>However, in React, the action attribute is considered a special prop - meaning React builds on top of it to allow actions to be invoked.</w:t>
       </w:r>
     </w:p>
@@ -1543,8 +1101,312 @@
           <w:bCs/>
           <w:u w:val="single"/>
         </w:rPr>
-        <w:t>Hierarchy</w:t>
-      </w:r>
+        <w:t xml:space="preserve">Before pushing to </w:t>
+      </w:r>
+      <w:proofErr w:type="gramStart"/>
+      <w:r>
+        <w:rPr>
+          <w:b/>
+          <w:bCs/>
+          <w:u w:val="single"/>
+        </w:rPr>
+        <w:t>git</w:t>
+      </w:r>
+      <w:proofErr w:type="gramEnd"/>
+      <w:r>
+        <w:rPr>
+          <w:b/>
+          <w:bCs/>
+          <w:u w:val="single"/>
+        </w:rPr>
+        <w:t xml:space="preserve"> one must</w:t>
+      </w:r>
+    </w:p>
+    <w:p>
+      <w:pPr>
+        <w:rPr>
+          <w:b/>
+          <w:bCs/>
+          <w:u w:val="single"/>
+        </w:rPr>
+      </w:pPr>
+    </w:p>
+    <w:p>
+      <w:pPr>
+        <w:spacing w:after="0" w:line="240" w:lineRule="auto"/>
+        <w:rPr>
+          <w:rFonts w:ascii="Times New Roman" w:eastAsia="Times New Roman" w:hAnsi="Times New Roman" w:cs="Times New Roman"/>
+          <w:kern w:val="0"/>
+          <w14:ligatures w14:val="none"/>
+        </w:rPr>
+      </w:pPr>
+      <w:r>
+        <w:rPr>
+          <w:rFonts w:ascii="Times New Roman" w:eastAsia="Times New Roman" w:hAnsi="Times New Roman" w:cs="Times New Roman"/>
+          <w:kern w:val="0"/>
+          <w14:ligatures w14:val="none"/>
+        </w:rPr>
+        <w:t>Great! Your application builds successfully. Now you're ready to push to Git and deploy to Vercel.Here's a summary of what we've done:</w:t>
+      </w:r>
+    </w:p>
+    <w:p>
+      <w:pPr>
+        <w:numPr>
+          <w:ilvl w:val="0"/>
+          <w:numId w:val="4"/>
+        </w:numPr>
+        <w:spacing w:before="30" w:after="30" w:line="240" w:lineRule="auto"/>
+        <w:ind w:left="960"/>
+        <w:rPr>
+          <w:rFonts w:ascii="Times New Roman" w:eastAsia="Times New Roman" w:hAnsi="Times New Roman" w:cs="Times New Roman"/>
+          <w:kern w:val="0"/>
+          <w14:ligatures w14:val="none"/>
+        </w:rPr>
+      </w:pPr>
+      <w:r>
+        <w:rPr>
+          <w:rFonts w:ascii="Times New Roman" w:eastAsia="Times New Roman" w:hAnsi="Times New Roman" w:cs="Times New Roman"/>
+          <w:kern w:val="0"/>
+          <w14:ligatures w14:val="none"/>
+        </w:rPr>
+        <w:t>Updated dependencies with </w:t>
+      </w:r>
+      <w:r>
+        <w:rPr>
+          <w:rFonts w:ascii="Menlo" w:eastAsia="Times New Roman" w:hAnsi="Menlo" w:cs="Menlo"/>
+          <w:kern w:val="0"/>
+          <w:sz w:val="22"/>
+          <w:szCs w:val="22"/>
+          <w14:ligatures w14:val="none"/>
+        </w:rPr>
+        <w:t>npm install</w:t>
+      </w:r>
+    </w:p>
+    <w:p>
+      <w:pPr>
+        <w:numPr>
+          <w:ilvl w:val="0"/>
+          <w:numId w:val="5"/>
+        </w:numPr>
+        <w:spacing w:before="30" w:after="30" w:line="240" w:lineRule="auto"/>
+        <w:ind w:left="960"/>
+        <w:rPr>
+          <w:rFonts w:ascii="Times New Roman" w:eastAsia="Times New Roman" w:hAnsi="Times New Roman" w:cs="Times New Roman"/>
+          <w:kern w:val="0"/>
+          <w14:ligatures w14:val="none"/>
+        </w:rPr>
+      </w:pPr>
+      <w:r>
+        <w:rPr>
+          <w:rFonts w:ascii="Times New Roman" w:eastAsia="Times New Roman" w:hAnsi="Times New Roman" w:cs="Times New Roman"/>
+          <w:kern w:val="0"/>
+          <w14:ligatures w14:val="none"/>
+        </w:rPr>
+        <w:t>Fixed security vulnerabilities with </w:t>
+      </w:r>
+      <w:r>
+        <w:rPr>
+          <w:rFonts w:ascii="Menlo" w:eastAsia="Times New Roman" w:hAnsi="Menlo" w:cs="Menlo"/>
+          <w:kern w:val="0"/>
+          <w:sz w:val="22"/>
+          <w:szCs w:val="22"/>
+          <w14:ligatures w14:val="none"/>
+        </w:rPr>
+        <w:t>npm audit fix</w:t>
+      </w:r>
+    </w:p>
+    <w:p>
+      <w:pPr>
+        <w:numPr>
+          <w:ilvl w:val="0"/>
+          <w:numId w:val="6"/>
+        </w:numPr>
+        <w:spacing w:before="30" w:after="30" w:line="240" w:lineRule="auto"/>
+        <w:ind w:left="960"/>
+        <w:rPr>
+          <w:rFonts w:ascii="Times New Roman" w:eastAsia="Times New Roman" w:hAnsi="Times New Roman" w:cs="Times New Roman"/>
+          <w:kern w:val="0"/>
+          <w14:ligatures w14:val="none"/>
+        </w:rPr>
+      </w:pPr>
+      <w:r>
+        <w:rPr>
+          <w:rFonts w:ascii="Times New Roman" w:eastAsia="Times New Roman" w:hAnsi="Times New Roman" w:cs="Times New Roman"/>
+          <w:kern w:val="0"/>
+          <w14:ligatures w14:val="none"/>
+        </w:rPr>
+        <w:t>Verified the build process with </w:t>
+      </w:r>
+      <w:r>
+        <w:rPr>
+          <w:rFonts w:ascii="Menlo" w:eastAsia="Times New Roman" w:hAnsi="Menlo" w:cs="Menlo"/>
+          <w:kern w:val="0"/>
+          <w:sz w:val="22"/>
+          <w:szCs w:val="22"/>
+          <w14:ligatures w14:val="none"/>
+        </w:rPr>
+        <w:t>npm run build</w:t>
+      </w:r>
+    </w:p>
+    <w:p>
+      <w:pPr>
+        <w:spacing w:after="0" w:line="240" w:lineRule="auto"/>
+        <w:rPr>
+          <w:rFonts w:ascii="Times New Roman" w:eastAsia="Times New Roman" w:hAnsi="Times New Roman" w:cs="Times New Roman"/>
+          <w:kern w:val="0"/>
+          <w14:ligatures w14:val="none"/>
+        </w:rPr>
+      </w:pPr>
+      <w:r>
+        <w:rPr>
+          <w:rFonts w:ascii="Times New Roman" w:eastAsia="Times New Roman" w:hAnsi="Times New Roman" w:cs="Times New Roman"/>
+          <w:kern w:val="0"/>
+          <w14:ligatures w14:val="none"/>
+        </w:rPr>
+        <w:t xml:space="preserve">All of these steps have completed successfully, which means your application is ready for </w:t>
+      </w:r>
+      <w:proofErr w:type="gramStart"/>
+      <w:r>
+        <w:rPr>
+          <w:rFonts w:ascii="Times New Roman" w:eastAsia="Times New Roman" w:hAnsi="Times New Roman" w:cs="Times New Roman"/>
+          <w:kern w:val="0"/>
+          <w14:ligatures w14:val="none"/>
+        </w:rPr>
+        <w:t>deployment.When</w:t>
+      </w:r>
+      <w:proofErr w:type="gramEnd"/>
+      <w:r>
+        <w:rPr>
+          <w:rFonts w:ascii="Times New Roman" w:eastAsia="Times New Roman" w:hAnsi="Times New Roman" w:cs="Times New Roman"/>
+          <w:kern w:val="0"/>
+          <w14:ligatures w14:val="none"/>
+        </w:rPr>
+        <w:t xml:space="preserve"> you push to Git and deploy to Vercel, make sure to:</w:t>
+      </w:r>
+    </w:p>
+    <w:p>
+      <w:pPr>
+        <w:numPr>
+          <w:ilvl w:val="0"/>
+          <w:numId w:val="7"/>
+        </w:numPr>
+        <w:spacing w:before="30" w:after="30" w:line="240" w:lineRule="auto"/>
+        <w:ind w:left="960"/>
+        <w:rPr>
+          <w:rFonts w:ascii="Times New Roman" w:eastAsia="Times New Roman" w:hAnsi="Times New Roman" w:cs="Times New Roman"/>
+          <w:kern w:val="0"/>
+          <w14:ligatures w14:val="none"/>
+        </w:rPr>
+      </w:pPr>
+      <w:r>
+        <w:rPr>
+          <w:rFonts w:ascii="Times New Roman" w:eastAsia="Times New Roman" w:hAnsi="Times New Roman" w:cs="Times New Roman"/>
+          <w:kern w:val="0"/>
+          <w14:ligatures w14:val="none"/>
+        </w:rPr>
+        <w:t>Include all your changes, including the updated </w:t>
+      </w:r>
+      <w:r>
+        <w:rPr>
+          <w:rFonts w:ascii="Menlo" w:eastAsia="Times New Roman" w:hAnsi="Menlo" w:cs="Menlo"/>
+          <w:kern w:val="0"/>
+          <w:sz w:val="22"/>
+          <w:szCs w:val="22"/>
+          <w14:ligatures w14:val="none"/>
+        </w:rPr>
+        <w:t>package-lock.json</w:t>
+      </w:r>
+      <w:r>
+        <w:rPr>
+          <w:rFonts w:ascii="Times New Roman" w:eastAsia="Times New Roman" w:hAnsi="Times New Roman" w:cs="Times New Roman"/>
+          <w:kern w:val="0"/>
+          <w14:ligatures w14:val="none"/>
+        </w:rPr>
+        <w:t> file</w:t>
+      </w:r>
+    </w:p>
+    <w:p>
+      <w:pPr>
+        <w:numPr>
+          <w:ilvl w:val="0"/>
+          <w:numId w:val="8"/>
+        </w:numPr>
+        <w:spacing w:before="30" w:after="30" w:line="240" w:lineRule="auto"/>
+        <w:ind w:left="960"/>
+        <w:rPr>
+          <w:rFonts w:ascii="Times New Roman" w:eastAsia="Times New Roman" w:hAnsi="Times New Roman" w:cs="Times New Roman"/>
+          <w:kern w:val="0"/>
+          <w14:ligatures w14:val="none"/>
+        </w:rPr>
+      </w:pPr>
+      <w:r>
+        <w:rPr>
+          <w:rFonts w:ascii="Times New Roman" w:eastAsia="Times New Roman" w:hAnsi="Times New Roman" w:cs="Times New Roman"/>
+          <w:kern w:val="0"/>
+          <w14:ligatures w14:val="none"/>
+        </w:rPr>
+        <w:t>Set up all the necessary environment variables in your Vercel project settings</w:t>
+      </w:r>
+    </w:p>
+    <w:p>
+      <w:pPr>
+        <w:numPr>
+          <w:ilvl w:val="0"/>
+          <w:numId w:val="9"/>
+        </w:numPr>
+        <w:spacing w:before="30" w:after="30" w:line="240" w:lineRule="auto"/>
+        <w:ind w:left="960"/>
+        <w:rPr>
+          <w:rFonts w:ascii="Times New Roman" w:eastAsia="Times New Roman" w:hAnsi="Times New Roman" w:cs="Times New Roman"/>
+          <w:kern w:val="0"/>
+          <w14:ligatures w14:val="none"/>
+        </w:rPr>
+      </w:pPr>
+      <w:r>
+        <w:rPr>
+          <w:rFonts w:ascii="Times New Roman" w:eastAsia="Times New Roman" w:hAnsi="Times New Roman" w:cs="Times New Roman"/>
+          <w:kern w:val="0"/>
+          <w14:ligatures w14:val="none"/>
+        </w:rPr>
+        <w:lastRenderedPageBreak/>
+        <w:t>Test the interview approval functionality in the production environment after deployment</w:t>
+      </w:r>
+    </w:p>
+    <w:p>
+      <w:pPr>
+        <w:rPr>
+          <w:b/>
+          <w:bCs/>
+          <w:u w:val="single"/>
+        </w:rPr>
+      </w:pPr>
+    </w:p>
+    <w:p>
+      <w:pPr>
+        <w:rPr>
+          <w:b/>
+          <w:bCs/>
+          <w:u w:val="single"/>
+        </w:rPr>
+      </w:pPr>
+    </w:p>
+    <w:p>
+      <w:pPr>
+        <w:rPr>
+          <w:b/>
+          <w:bCs/>
+          <w:u w:val="single"/>
+        </w:rPr>
+      </w:pPr>
+    </w:p>
+    <w:p>
+      <w:pPr>
+        <w:rPr>
+          <w:b/>
+          <w:bCs/>
+          <w:u w:val="single"/>
+        </w:rPr>
+      </w:pPr>
     </w:p>
     <w:sectPr>
       <w:pgSz w:w="12240" w:h="15840"/>
@@ -1672,6 +1534,119 @@
     </w:lvl>
   </w:abstractNum>
   <w:abstractNum w:abstractNumId="1" w15:restartNumberingAfterBreak="0">
+    <w:nsid w:val="2CAC0E97"/>
+    <w:multiLevelType w:val="multilevel"/>
+    <w:tmpl w:val="C6DEDDBC"/>
+    <w:lvl w:ilvl="0">
+      <w:start w:val="1"/>
+      <w:numFmt w:val="decimal"/>
+      <w:lvlText w:val="%1."/>
+      <w:lvlJc w:val="left"/>
+      <w:pPr>
+        <w:tabs>
+          <w:tab w:val="num" w:pos="720"/>
+        </w:tabs>
+        <w:ind w:left="720" w:hanging="360"/>
+      </w:pPr>
+    </w:lvl>
+    <w:lvl w:ilvl="1" w:tentative="1">
+      <w:start w:val="1"/>
+      <w:numFmt w:val="decimal"/>
+      <w:lvlText w:val="%2."/>
+      <w:lvlJc w:val="left"/>
+      <w:pPr>
+        <w:tabs>
+          <w:tab w:val="num" w:pos="1440"/>
+        </w:tabs>
+        <w:ind w:left="1440" w:hanging="360"/>
+      </w:pPr>
+    </w:lvl>
+    <w:lvl w:ilvl="2" w:tentative="1">
+      <w:start w:val="1"/>
+      <w:numFmt w:val="decimal"/>
+      <w:lvlText w:val="%3."/>
+      <w:lvlJc w:val="left"/>
+      <w:pPr>
+        <w:tabs>
+          <w:tab w:val="num" w:pos="2160"/>
+        </w:tabs>
+        <w:ind w:left="2160" w:hanging="360"/>
+      </w:pPr>
+    </w:lvl>
+    <w:lvl w:ilvl="3" w:tentative="1">
+      <w:start w:val="1"/>
+      <w:numFmt w:val="decimal"/>
+      <w:lvlText w:val="%4."/>
+      <w:lvlJc w:val="left"/>
+      <w:pPr>
+        <w:tabs>
+          <w:tab w:val="num" w:pos="2880"/>
+        </w:tabs>
+        <w:ind w:left="2880" w:hanging="360"/>
+      </w:pPr>
+    </w:lvl>
+    <w:lvl w:ilvl="4" w:tentative="1">
+      <w:start w:val="1"/>
+      <w:numFmt w:val="decimal"/>
+      <w:lvlText w:val="%5."/>
+      <w:lvlJc w:val="left"/>
+      <w:pPr>
+        <w:tabs>
+          <w:tab w:val="num" w:pos="3600"/>
+        </w:tabs>
+        <w:ind w:left="3600" w:hanging="360"/>
+      </w:pPr>
+    </w:lvl>
+    <w:lvl w:ilvl="5" w:tentative="1">
+      <w:start w:val="1"/>
+      <w:numFmt w:val="decimal"/>
+      <w:lvlText w:val="%6."/>
+      <w:lvlJc w:val="left"/>
+      <w:pPr>
+        <w:tabs>
+          <w:tab w:val="num" w:pos="4320"/>
+        </w:tabs>
+        <w:ind w:left="4320" w:hanging="360"/>
+      </w:pPr>
+    </w:lvl>
+    <w:lvl w:ilvl="6" w:tentative="1">
+      <w:start w:val="1"/>
+      <w:numFmt w:val="decimal"/>
+      <w:lvlText w:val="%7."/>
+      <w:lvlJc w:val="left"/>
+      <w:pPr>
+        <w:tabs>
+          <w:tab w:val="num" w:pos="5040"/>
+        </w:tabs>
+        <w:ind w:left="5040" w:hanging="360"/>
+      </w:pPr>
+    </w:lvl>
+    <w:lvl w:ilvl="7" w:tentative="1">
+      <w:start w:val="1"/>
+      <w:numFmt w:val="decimal"/>
+      <w:lvlText w:val="%8."/>
+      <w:lvlJc w:val="left"/>
+      <w:pPr>
+        <w:tabs>
+          <w:tab w:val="num" w:pos="5760"/>
+        </w:tabs>
+        <w:ind w:left="5760" w:hanging="360"/>
+      </w:pPr>
+    </w:lvl>
+    <w:lvl w:ilvl="8" w:tentative="1">
+      <w:start w:val="1"/>
+      <w:numFmt w:val="decimal"/>
+      <w:lvlText w:val="%9."/>
+      <w:lvlJc w:val="left"/>
+      <w:pPr>
+        <w:tabs>
+          <w:tab w:val="num" w:pos="6480"/>
+        </w:tabs>
+        <w:ind w:left="6480" w:hanging="360"/>
+      </w:pPr>
+    </w:lvl>
+  </w:abstractNum>
+  <w:abstractNum w:abstractNumId="2" w15:restartNumberingAfterBreak="0">
     <w:nsid w:val="331B5FA6"/>
     <w:multiLevelType w:val="hybridMultilevel"/>
     <w:tmpl w:val="4C7EDD90"/>
@@ -1783,7 +1758,346 @@
       </w:rPr>
     </w:lvl>
   </w:abstractNum>
-  <w:abstractNum w:abstractNumId="2" w15:restartNumberingAfterBreak="0">
+  <w:abstractNum w:abstractNumId="3" w15:restartNumberingAfterBreak="0">
+    <w:nsid w:val="4AA7318D"/>
+    <w:multiLevelType w:val="multilevel"/>
+    <w:tmpl w:val="742E73A0"/>
+    <w:lvl w:ilvl="0">
+      <w:start w:val="1"/>
+      <w:numFmt w:val="decimal"/>
+      <w:lvlText w:val="%1."/>
+      <w:lvlJc w:val="left"/>
+      <w:pPr>
+        <w:tabs>
+          <w:tab w:val="num" w:pos="720"/>
+        </w:tabs>
+        <w:ind w:left="720" w:hanging="360"/>
+      </w:pPr>
+    </w:lvl>
+    <w:lvl w:ilvl="1" w:tentative="1">
+      <w:start w:val="1"/>
+      <w:numFmt w:val="decimal"/>
+      <w:lvlText w:val="%2."/>
+      <w:lvlJc w:val="left"/>
+      <w:pPr>
+        <w:tabs>
+          <w:tab w:val="num" w:pos="1440"/>
+        </w:tabs>
+        <w:ind w:left="1440" w:hanging="360"/>
+      </w:pPr>
+    </w:lvl>
+    <w:lvl w:ilvl="2" w:tentative="1">
+      <w:start w:val="1"/>
+      <w:numFmt w:val="decimal"/>
+      <w:lvlText w:val="%3."/>
+      <w:lvlJc w:val="left"/>
+      <w:pPr>
+        <w:tabs>
+          <w:tab w:val="num" w:pos="2160"/>
+        </w:tabs>
+        <w:ind w:left="2160" w:hanging="360"/>
+      </w:pPr>
+    </w:lvl>
+    <w:lvl w:ilvl="3" w:tentative="1">
+      <w:start w:val="1"/>
+      <w:numFmt w:val="decimal"/>
+      <w:lvlText w:val="%4."/>
+      <w:lvlJc w:val="left"/>
+      <w:pPr>
+        <w:tabs>
+          <w:tab w:val="num" w:pos="2880"/>
+        </w:tabs>
+        <w:ind w:left="2880" w:hanging="360"/>
+      </w:pPr>
+    </w:lvl>
+    <w:lvl w:ilvl="4" w:tentative="1">
+      <w:start w:val="1"/>
+      <w:numFmt w:val="decimal"/>
+      <w:lvlText w:val="%5."/>
+      <w:lvlJc w:val="left"/>
+      <w:pPr>
+        <w:tabs>
+          <w:tab w:val="num" w:pos="3600"/>
+        </w:tabs>
+        <w:ind w:left="3600" w:hanging="360"/>
+      </w:pPr>
+    </w:lvl>
+    <w:lvl w:ilvl="5" w:tentative="1">
+      <w:start w:val="1"/>
+      <w:numFmt w:val="decimal"/>
+      <w:lvlText w:val="%6."/>
+      <w:lvlJc w:val="left"/>
+      <w:pPr>
+        <w:tabs>
+          <w:tab w:val="num" w:pos="4320"/>
+        </w:tabs>
+        <w:ind w:left="4320" w:hanging="360"/>
+      </w:pPr>
+    </w:lvl>
+    <w:lvl w:ilvl="6" w:tentative="1">
+      <w:start w:val="1"/>
+      <w:numFmt w:val="decimal"/>
+      <w:lvlText w:val="%7."/>
+      <w:lvlJc w:val="left"/>
+      <w:pPr>
+        <w:tabs>
+          <w:tab w:val="num" w:pos="5040"/>
+        </w:tabs>
+        <w:ind w:left="5040" w:hanging="360"/>
+      </w:pPr>
+    </w:lvl>
+    <w:lvl w:ilvl="7" w:tentative="1">
+      <w:start w:val="1"/>
+      <w:numFmt w:val="decimal"/>
+      <w:lvlText w:val="%8."/>
+      <w:lvlJc w:val="left"/>
+      <w:pPr>
+        <w:tabs>
+          <w:tab w:val="num" w:pos="5760"/>
+        </w:tabs>
+        <w:ind w:left="5760" w:hanging="360"/>
+      </w:pPr>
+    </w:lvl>
+    <w:lvl w:ilvl="8" w:tentative="1">
+      <w:start w:val="1"/>
+      <w:numFmt w:val="decimal"/>
+      <w:lvlText w:val="%9."/>
+      <w:lvlJc w:val="left"/>
+      <w:pPr>
+        <w:tabs>
+          <w:tab w:val="num" w:pos="6480"/>
+        </w:tabs>
+        <w:ind w:left="6480" w:hanging="360"/>
+      </w:pPr>
+    </w:lvl>
+  </w:abstractNum>
+  <w:abstractNum w:abstractNumId="4" w15:restartNumberingAfterBreak="0">
+    <w:nsid w:val="582E2740"/>
+    <w:multiLevelType w:val="multilevel"/>
+    <w:tmpl w:val="1BE22FDE"/>
+    <w:lvl w:ilvl="0">
+      <w:start w:val="1"/>
+      <w:numFmt w:val="decimal"/>
+      <w:lvlText w:val="%1."/>
+      <w:lvlJc w:val="left"/>
+      <w:pPr>
+        <w:tabs>
+          <w:tab w:val="num" w:pos="720"/>
+        </w:tabs>
+        <w:ind w:left="720" w:hanging="360"/>
+      </w:pPr>
+    </w:lvl>
+    <w:lvl w:ilvl="1" w:tentative="1">
+      <w:start w:val="1"/>
+      <w:numFmt w:val="decimal"/>
+      <w:lvlText w:val="%2."/>
+      <w:lvlJc w:val="left"/>
+      <w:pPr>
+        <w:tabs>
+          <w:tab w:val="num" w:pos="1440"/>
+        </w:tabs>
+        <w:ind w:left="1440" w:hanging="360"/>
+      </w:pPr>
+    </w:lvl>
+    <w:lvl w:ilvl="2" w:tentative="1">
+      <w:start w:val="1"/>
+      <w:numFmt w:val="decimal"/>
+      <w:lvlText w:val="%3."/>
+      <w:lvlJc w:val="left"/>
+      <w:pPr>
+        <w:tabs>
+          <w:tab w:val="num" w:pos="2160"/>
+        </w:tabs>
+        <w:ind w:left="2160" w:hanging="360"/>
+      </w:pPr>
+    </w:lvl>
+    <w:lvl w:ilvl="3" w:tentative="1">
+      <w:start w:val="1"/>
+      <w:numFmt w:val="decimal"/>
+      <w:lvlText w:val="%4."/>
+      <w:lvlJc w:val="left"/>
+      <w:pPr>
+        <w:tabs>
+          <w:tab w:val="num" w:pos="2880"/>
+        </w:tabs>
+        <w:ind w:left="2880" w:hanging="360"/>
+      </w:pPr>
+    </w:lvl>
+    <w:lvl w:ilvl="4" w:tentative="1">
+      <w:start w:val="1"/>
+      <w:numFmt w:val="decimal"/>
+      <w:lvlText w:val="%5."/>
+      <w:lvlJc w:val="left"/>
+      <w:pPr>
+        <w:tabs>
+          <w:tab w:val="num" w:pos="3600"/>
+        </w:tabs>
+        <w:ind w:left="3600" w:hanging="360"/>
+      </w:pPr>
+    </w:lvl>
+    <w:lvl w:ilvl="5" w:tentative="1">
+      <w:start w:val="1"/>
+      <w:numFmt w:val="decimal"/>
+      <w:lvlText w:val="%6."/>
+      <w:lvlJc w:val="left"/>
+      <w:pPr>
+        <w:tabs>
+          <w:tab w:val="num" w:pos="4320"/>
+        </w:tabs>
+        <w:ind w:left="4320" w:hanging="360"/>
+      </w:pPr>
+    </w:lvl>
+    <w:lvl w:ilvl="6" w:tentative="1">
+      <w:start w:val="1"/>
+      <w:numFmt w:val="decimal"/>
+      <w:lvlText w:val="%7."/>
+      <w:lvlJc w:val="left"/>
+      <w:pPr>
+        <w:tabs>
+          <w:tab w:val="num" w:pos="5040"/>
+        </w:tabs>
+        <w:ind w:left="5040" w:hanging="360"/>
+      </w:pPr>
+    </w:lvl>
+    <w:lvl w:ilvl="7" w:tentative="1">
+      <w:start w:val="1"/>
+      <w:numFmt w:val="decimal"/>
+      <w:lvlText w:val="%8."/>
+      <w:lvlJc w:val="left"/>
+      <w:pPr>
+        <w:tabs>
+          <w:tab w:val="num" w:pos="5760"/>
+        </w:tabs>
+        <w:ind w:left="5760" w:hanging="360"/>
+      </w:pPr>
+    </w:lvl>
+    <w:lvl w:ilvl="8" w:tentative="1">
+      <w:start w:val="1"/>
+      <w:numFmt w:val="decimal"/>
+      <w:lvlText w:val="%9."/>
+      <w:lvlJc w:val="left"/>
+      <w:pPr>
+        <w:tabs>
+          <w:tab w:val="num" w:pos="6480"/>
+        </w:tabs>
+        <w:ind w:left="6480" w:hanging="360"/>
+      </w:pPr>
+    </w:lvl>
+  </w:abstractNum>
+  <w:abstractNum w:abstractNumId="5" w15:restartNumberingAfterBreak="0">
+    <w:nsid w:val="5AEA19FA"/>
+    <w:multiLevelType w:val="multilevel"/>
+    <w:tmpl w:val="7BA86B56"/>
+    <w:lvl w:ilvl="0">
+      <w:start w:val="1"/>
+      <w:numFmt w:val="decimal"/>
+      <w:lvlText w:val="%1."/>
+      <w:lvlJc w:val="left"/>
+      <w:pPr>
+        <w:tabs>
+          <w:tab w:val="num" w:pos="720"/>
+        </w:tabs>
+        <w:ind w:left="720" w:hanging="360"/>
+      </w:pPr>
+    </w:lvl>
+    <w:lvl w:ilvl="1" w:tentative="1">
+      <w:start w:val="1"/>
+      <w:numFmt w:val="decimal"/>
+      <w:lvlText w:val="%2."/>
+      <w:lvlJc w:val="left"/>
+      <w:pPr>
+        <w:tabs>
+          <w:tab w:val="num" w:pos="1440"/>
+        </w:tabs>
+        <w:ind w:left="1440" w:hanging="360"/>
+      </w:pPr>
+    </w:lvl>
+    <w:lvl w:ilvl="2" w:tentative="1">
+      <w:start w:val="1"/>
+      <w:numFmt w:val="decimal"/>
+      <w:lvlText w:val="%3."/>
+      <w:lvlJc w:val="left"/>
+      <w:pPr>
+        <w:tabs>
+          <w:tab w:val="num" w:pos="2160"/>
+        </w:tabs>
+        <w:ind w:left="2160" w:hanging="360"/>
+      </w:pPr>
+    </w:lvl>
+    <w:lvl w:ilvl="3" w:tentative="1">
+      <w:start w:val="1"/>
+      <w:numFmt w:val="decimal"/>
+      <w:lvlText w:val="%4."/>
+      <w:lvlJc w:val="left"/>
+      <w:pPr>
+        <w:tabs>
+          <w:tab w:val="num" w:pos="2880"/>
+        </w:tabs>
+        <w:ind w:left="2880" w:hanging="360"/>
+      </w:pPr>
+    </w:lvl>
+    <w:lvl w:ilvl="4" w:tentative="1">
+      <w:start w:val="1"/>
+      <w:numFmt w:val="decimal"/>
+      <w:lvlText w:val="%5."/>
+      <w:lvlJc w:val="left"/>
+      <w:pPr>
+        <w:tabs>
+          <w:tab w:val="num" w:pos="3600"/>
+        </w:tabs>
+        <w:ind w:left="3600" w:hanging="360"/>
+      </w:pPr>
+    </w:lvl>
+    <w:lvl w:ilvl="5" w:tentative="1">
+      <w:start w:val="1"/>
+      <w:numFmt w:val="decimal"/>
+      <w:lvlText w:val="%6."/>
+      <w:lvlJc w:val="left"/>
+      <w:pPr>
+        <w:tabs>
+          <w:tab w:val="num" w:pos="4320"/>
+        </w:tabs>
+        <w:ind w:left="4320" w:hanging="360"/>
+      </w:pPr>
+    </w:lvl>
+    <w:lvl w:ilvl="6" w:tentative="1">
+      <w:start w:val="1"/>
+      <w:numFmt w:val="decimal"/>
+      <w:lvlText w:val="%7."/>
+      <w:lvlJc w:val="left"/>
+      <w:pPr>
+        <w:tabs>
+          <w:tab w:val="num" w:pos="5040"/>
+        </w:tabs>
+        <w:ind w:left="5040" w:hanging="360"/>
+      </w:pPr>
+    </w:lvl>
+    <w:lvl w:ilvl="7" w:tentative="1">
+      <w:start w:val="1"/>
+      <w:numFmt w:val="decimal"/>
+      <w:lvlText w:val="%8."/>
+      <w:lvlJc w:val="left"/>
+      <w:pPr>
+        <w:tabs>
+          <w:tab w:val="num" w:pos="5760"/>
+        </w:tabs>
+        <w:ind w:left="5760" w:hanging="360"/>
+      </w:pPr>
+    </w:lvl>
+    <w:lvl w:ilvl="8" w:tentative="1">
+      <w:start w:val="1"/>
+      <w:numFmt w:val="decimal"/>
+      <w:lvlText w:val="%9."/>
+      <w:lvlJc w:val="left"/>
+      <w:pPr>
+        <w:tabs>
+          <w:tab w:val="num" w:pos="6480"/>
+        </w:tabs>
+        <w:ind w:left="6480" w:hanging="360"/>
+      </w:pPr>
+    </w:lvl>
+  </w:abstractNum>
+  <w:abstractNum w:abstractNumId="6" w15:restartNumberingAfterBreak="0">
     <w:nsid w:val="5CAF5FF4"/>
     <w:multiLevelType w:val="hybridMultilevel"/>
     <w:tmpl w:val="BC0CC198"/>
@@ -1896,14 +2210,276 @@
       </w:rPr>
     </w:lvl>
   </w:abstractNum>
+  <w:abstractNum w:abstractNumId="7" w15:restartNumberingAfterBreak="0">
+    <w:nsid w:val="76FF6EA5"/>
+    <w:multiLevelType w:val="multilevel"/>
+    <w:tmpl w:val="05A8594C"/>
+    <w:lvl w:ilvl="0">
+      <w:start w:val="1"/>
+      <w:numFmt w:val="decimal"/>
+      <w:lvlText w:val="%1."/>
+      <w:lvlJc w:val="left"/>
+      <w:pPr>
+        <w:tabs>
+          <w:tab w:val="num" w:pos="720"/>
+        </w:tabs>
+        <w:ind w:left="720" w:hanging="360"/>
+      </w:pPr>
+    </w:lvl>
+    <w:lvl w:ilvl="1" w:tentative="1">
+      <w:start w:val="1"/>
+      <w:numFmt w:val="decimal"/>
+      <w:lvlText w:val="%2."/>
+      <w:lvlJc w:val="left"/>
+      <w:pPr>
+        <w:tabs>
+          <w:tab w:val="num" w:pos="1440"/>
+        </w:tabs>
+        <w:ind w:left="1440" w:hanging="360"/>
+      </w:pPr>
+    </w:lvl>
+    <w:lvl w:ilvl="2" w:tentative="1">
+      <w:start w:val="1"/>
+      <w:numFmt w:val="decimal"/>
+      <w:lvlText w:val="%3."/>
+      <w:lvlJc w:val="left"/>
+      <w:pPr>
+        <w:tabs>
+          <w:tab w:val="num" w:pos="2160"/>
+        </w:tabs>
+        <w:ind w:left="2160" w:hanging="360"/>
+      </w:pPr>
+    </w:lvl>
+    <w:lvl w:ilvl="3" w:tentative="1">
+      <w:start w:val="1"/>
+      <w:numFmt w:val="decimal"/>
+      <w:lvlText w:val="%4."/>
+      <w:lvlJc w:val="left"/>
+      <w:pPr>
+        <w:tabs>
+          <w:tab w:val="num" w:pos="2880"/>
+        </w:tabs>
+        <w:ind w:left="2880" w:hanging="360"/>
+      </w:pPr>
+    </w:lvl>
+    <w:lvl w:ilvl="4" w:tentative="1">
+      <w:start w:val="1"/>
+      <w:numFmt w:val="decimal"/>
+      <w:lvlText w:val="%5."/>
+      <w:lvlJc w:val="left"/>
+      <w:pPr>
+        <w:tabs>
+          <w:tab w:val="num" w:pos="3600"/>
+        </w:tabs>
+        <w:ind w:left="3600" w:hanging="360"/>
+      </w:pPr>
+    </w:lvl>
+    <w:lvl w:ilvl="5" w:tentative="1">
+      <w:start w:val="1"/>
+      <w:numFmt w:val="decimal"/>
+      <w:lvlText w:val="%6."/>
+      <w:lvlJc w:val="left"/>
+      <w:pPr>
+        <w:tabs>
+          <w:tab w:val="num" w:pos="4320"/>
+        </w:tabs>
+        <w:ind w:left="4320" w:hanging="360"/>
+      </w:pPr>
+    </w:lvl>
+    <w:lvl w:ilvl="6" w:tentative="1">
+      <w:start w:val="1"/>
+      <w:numFmt w:val="decimal"/>
+      <w:lvlText w:val="%7."/>
+      <w:lvlJc w:val="left"/>
+      <w:pPr>
+        <w:tabs>
+          <w:tab w:val="num" w:pos="5040"/>
+        </w:tabs>
+        <w:ind w:left="5040" w:hanging="360"/>
+      </w:pPr>
+    </w:lvl>
+    <w:lvl w:ilvl="7" w:tentative="1">
+      <w:start w:val="1"/>
+      <w:numFmt w:val="decimal"/>
+      <w:lvlText w:val="%8."/>
+      <w:lvlJc w:val="left"/>
+      <w:pPr>
+        <w:tabs>
+          <w:tab w:val="num" w:pos="5760"/>
+        </w:tabs>
+        <w:ind w:left="5760" w:hanging="360"/>
+      </w:pPr>
+    </w:lvl>
+    <w:lvl w:ilvl="8" w:tentative="1">
+      <w:start w:val="1"/>
+      <w:numFmt w:val="decimal"/>
+      <w:lvlText w:val="%9."/>
+      <w:lvlJc w:val="left"/>
+      <w:pPr>
+        <w:tabs>
+          <w:tab w:val="num" w:pos="6480"/>
+        </w:tabs>
+        <w:ind w:left="6480" w:hanging="360"/>
+      </w:pPr>
+    </w:lvl>
+  </w:abstractNum>
+  <w:abstractNum w:abstractNumId="8" w15:restartNumberingAfterBreak="0">
+    <w:nsid w:val="7C9654E6"/>
+    <w:multiLevelType w:val="multilevel"/>
+    <w:tmpl w:val="74241DAE"/>
+    <w:lvl w:ilvl="0">
+      <w:start w:val="1"/>
+      <w:numFmt w:val="decimal"/>
+      <w:lvlText w:val="%1."/>
+      <w:lvlJc w:val="left"/>
+      <w:pPr>
+        <w:tabs>
+          <w:tab w:val="num" w:pos="720"/>
+        </w:tabs>
+        <w:ind w:left="720" w:hanging="360"/>
+      </w:pPr>
+    </w:lvl>
+    <w:lvl w:ilvl="1" w:tentative="1">
+      <w:start w:val="1"/>
+      <w:numFmt w:val="decimal"/>
+      <w:lvlText w:val="%2."/>
+      <w:lvlJc w:val="left"/>
+      <w:pPr>
+        <w:tabs>
+          <w:tab w:val="num" w:pos="1440"/>
+        </w:tabs>
+        <w:ind w:left="1440" w:hanging="360"/>
+      </w:pPr>
+    </w:lvl>
+    <w:lvl w:ilvl="2" w:tentative="1">
+      <w:start w:val="1"/>
+      <w:numFmt w:val="decimal"/>
+      <w:lvlText w:val="%3."/>
+      <w:lvlJc w:val="left"/>
+      <w:pPr>
+        <w:tabs>
+          <w:tab w:val="num" w:pos="2160"/>
+        </w:tabs>
+        <w:ind w:left="2160" w:hanging="360"/>
+      </w:pPr>
+    </w:lvl>
+    <w:lvl w:ilvl="3" w:tentative="1">
+      <w:start w:val="1"/>
+      <w:numFmt w:val="decimal"/>
+      <w:lvlText w:val="%4."/>
+      <w:lvlJc w:val="left"/>
+      <w:pPr>
+        <w:tabs>
+          <w:tab w:val="num" w:pos="2880"/>
+        </w:tabs>
+        <w:ind w:left="2880" w:hanging="360"/>
+      </w:pPr>
+    </w:lvl>
+    <w:lvl w:ilvl="4" w:tentative="1">
+      <w:start w:val="1"/>
+      <w:numFmt w:val="decimal"/>
+      <w:lvlText w:val="%5."/>
+      <w:lvlJc w:val="left"/>
+      <w:pPr>
+        <w:tabs>
+          <w:tab w:val="num" w:pos="3600"/>
+        </w:tabs>
+        <w:ind w:left="3600" w:hanging="360"/>
+      </w:pPr>
+    </w:lvl>
+    <w:lvl w:ilvl="5" w:tentative="1">
+      <w:start w:val="1"/>
+      <w:numFmt w:val="decimal"/>
+      <w:lvlText w:val="%6."/>
+      <w:lvlJc w:val="left"/>
+      <w:pPr>
+        <w:tabs>
+          <w:tab w:val="num" w:pos="4320"/>
+        </w:tabs>
+        <w:ind w:left="4320" w:hanging="360"/>
+      </w:pPr>
+    </w:lvl>
+    <w:lvl w:ilvl="6" w:tentative="1">
+      <w:start w:val="1"/>
+      <w:numFmt w:val="decimal"/>
+      <w:lvlText w:val="%7."/>
+      <w:lvlJc w:val="left"/>
+      <w:pPr>
+        <w:tabs>
+          <w:tab w:val="num" w:pos="5040"/>
+        </w:tabs>
+        <w:ind w:left="5040" w:hanging="360"/>
+      </w:pPr>
+    </w:lvl>
+    <w:lvl w:ilvl="7" w:tentative="1">
+      <w:start w:val="1"/>
+      <w:numFmt w:val="decimal"/>
+      <w:lvlText w:val="%8."/>
+      <w:lvlJc w:val="left"/>
+      <w:pPr>
+        <w:tabs>
+          <w:tab w:val="num" w:pos="5760"/>
+        </w:tabs>
+        <w:ind w:left="5760" w:hanging="360"/>
+      </w:pPr>
+    </w:lvl>
+    <w:lvl w:ilvl="8" w:tentative="1">
+      <w:start w:val="1"/>
+      <w:numFmt w:val="decimal"/>
+      <w:lvlText w:val="%9."/>
+      <w:lvlJc w:val="left"/>
+      <w:pPr>
+        <w:tabs>
+          <w:tab w:val="num" w:pos="6480"/>
+        </w:tabs>
+        <w:ind w:left="6480" w:hanging="360"/>
+      </w:pPr>
+    </w:lvl>
+  </w:abstractNum>
   <w:num w:numId="1" w16cid:durableId="370571881">
-    <w:abstractNumId w:val="2"/>
+    <w:abstractNumId w:val="6"/>
   </w:num>
   <w:num w:numId="2" w16cid:durableId="159660506">
-    <w:abstractNumId w:val="1"/>
+    <w:abstractNumId w:val="2"/>
   </w:num>
   <w:num w:numId="3" w16cid:durableId="579677030">
     <w:abstractNumId w:val="0"/>
+  </w:num>
+  <w:num w:numId="4" w16cid:durableId="2013601543">
+    <w:abstractNumId w:val="4"/>
+    <w:lvlOverride w:ilvl="0">
+      <w:startOverride w:val="1"/>
+    </w:lvlOverride>
+  </w:num>
+  <w:num w:numId="5" w16cid:durableId="1250428343">
+    <w:abstractNumId w:val="3"/>
+    <w:lvlOverride w:ilvl="0">
+      <w:startOverride w:val="2"/>
+    </w:lvlOverride>
+  </w:num>
+  <w:num w:numId="6" w16cid:durableId="788091560">
+    <w:abstractNumId w:val="8"/>
+    <w:lvlOverride w:ilvl="0">
+      <w:startOverride w:val="3"/>
+    </w:lvlOverride>
+  </w:num>
+  <w:num w:numId="7" w16cid:durableId="675499804">
+    <w:abstractNumId w:val="7"/>
+    <w:lvlOverride w:ilvl="0">
+      <w:startOverride w:val="1"/>
+    </w:lvlOverride>
+  </w:num>
+  <w:num w:numId="8" w16cid:durableId="539558656">
+    <w:abstractNumId w:val="5"/>
+    <w:lvlOverride w:ilvl="0">
+      <w:startOverride w:val="2"/>
+    </w:lvlOverride>
+  </w:num>
+  <w:num w:numId="9" w16cid:durableId="124085061">
+    <w:abstractNumId w:val="1"/>
+    <w:lvlOverride w:ilvl="0">
+      <w:startOverride w:val="3"/>
+    </w:lvlOverride>
   </w:num>
 </w:numbering>
 </file>
@@ -2846,6 +3422,23 @@
       <w:shd w:val="clear" w:color="auto" w:fill="E1DFDD"/>
     </w:rPr>
   </w:style>
+  <w:style w:type="character" w:styleId="FollowedHyperlink">
+    <w:name w:val="FollowedHyperlink"/>
+    <w:basedOn w:val="DefaultParagraphFont"/>
+    <w:uiPriority w:val="99"/>
+    <w:semiHidden/>
+    <w:unhideWhenUsed/>
+    <w:rsid w:val="00D5154B"/>
+    <w:rPr>
+      <w:color w:val="96607D" w:themeColor="followedHyperlink"/>
+      <w:u w:val="single"/>
+    </w:rPr>
+  </w:style>
+  <w:style w:type="character" w:customStyle="1" w:styleId="markdown-inline-code">
+    <w:name w:val="markdown-inline-code"/>
+    <w:basedOn w:val="DefaultParagraphFont"/>
+    <w:rsid w:val="00D34810"/>
+  </w:style>
 </w:styles>
 </file>
 

</xml_diff>